<commit_message>
2Corinthians MSG audit: restore dropped content (EN 41/KO 24 fixes), fix ch11 header position, normalize msg_ranges, DOCX rebuilt+reuploaded
</commit_message>
<xml_diff>
--- a/gdocs_build/2Corinthians.docx
+++ b/gdocs_build/2Corinthians.docx
@@ -124,7 +124,7 @@
               <w:rPr>
                 <w:sz w:val="18"/>
               </w:rPr>
-              <w:t>Hey, it's Paul, on a special mission from Jesus himself, all part of God's master plan. I'm writing this to all the believers in Corinth and the whole Achaia area. Hope you're getting all the awesome perks from God our Father and our Lord Jesus Christ. And Timothy, someone you know and trust, is here with me too.</w:t>
+              <w:t>Hey, it's Paul, on a special mission from the Messiah, Jesus, all part of God's master plan. I'm writing this to all the believers in Corinth and the whole Achaia area. Hope you're getting all the awesome perks from God our Father and our Lord Jesus Christ. And Timothy, someone you know and trust, is here with me too.</w:t>
             </w:r>
           </w:p>
         </w:tc>
@@ -147,7 +147,7 @@
               <w:rPr>
                 <w:sz w:val="18"/>
               </w:rPr>
-              <w:t>안녕, 나 바울이야. 예수님이 직접 주신 특별 미션을 받고 온 거야, 하나님이 직접 계획하신. 고린도에 있는 하나님의 교회랑 아가야 지방에 있는 모든 믿는 친구들한테 이 편지를 써. 우리 아버지 하나님이랑 주 예수 그리스도가 주시는 모든 선물과 은혜가 다 너희 거 되길 바랄게! 너희도 잘 알고 믿는 디모데가 나랑 같이 있어.</w:t>
+              <w:t>안녕, 나 바울이야. 메시아이신 예수님이 직접 주신 특별 미션을 받고 온 거야, 하나님이 직접 계획하신. 고린도에 있는 하나님의 교회랑 아가야 지방에 있는 모든 믿는 친구들한테 이 편지를 써. 우리 아버지 하나님이랑 주 예수 그리스도가 주시는 모든 선물과 은혜가 다 너희 거 되길 바랄게! 너희도 잘 알고 믿는 디모데가 나랑 같이 있어.</w:t>
             </w:r>
           </w:p>
         </w:tc>
@@ -258,7 +258,7 @@
               <w:rPr>
                 <w:sz w:val="18"/>
               </w:rPr>
-              <w:t>Shout-out to the God and Father of our Lord, Jesus Christ! He's the Father of mercy and the God of all comfort. When we're going through tough times, he's right there with us. And then, before we even realize it, he brings us alongside someone else who's going through hard times, so we can be there for that person just like God was there for us. Following Jesus can be rough, for sure, but the good times he gives us, the healing and comfort, are just as real. We get a full dose of that too.</w:t>
+              <w:t>Shout-out to the God and Father of our Lord, Jesus the Messiah! He's the Father of mercy and the God of all comfort. When we're going through tough times, he's right there with us. And then, before we even realize it, he brings us alongside someone else who's going through hard times, so we can be there for that person just like God was there for us. Following Jesus can be rough, for sure, but the good times he gives us, the healing and comfort, are just as real. We get a full dose of that too.</w:t>
             </w:r>
           </w:p>
         </w:tc>
@@ -281,7 +281,7 @@
               <w:rPr>
                 <w:sz w:val="18"/>
               </w:rPr>
-              <w:t>우리 주 예수 그리스도의 아버지이신 하나님을 찬양하자! 자비로우신 아버지! 모든 위로의 하나님이셔! 우리가 힘든 시간을 보낼 때 그분이 우리 곁에 와주시고, 어느새 우리도 힘든 시간을 보내는 다른 사람 곁에 서서, 하나님이 우리에게 해주신 것처럼 그 사람을 위해 곁에 있어 주게 하셔. 메시아를 따르면서 힘든 일이 많긴 하지만, 그분의 치유와 위로가 주는 좋은 시간도 그만큼 많아. 우리도 그걸 완전 넉넉하게 받고 있거든.</w:t>
+              <w:t>우리 주 예수 메시아의 아버지이신 하나님을 찬양하자! 자비로우신 아버지! 모든 위로의 하나님이셔! 우리가 힘든 시간을 보낼 때 그분이 우리 곁에 와주시고, 어느새 우리도 힘든 시간을 보내는 다른 사람 곁에 서서, 하나님이 우리에게 해주신 것처럼 그 사람을 위해 곁에 있어 주게 하셔. 메시아를 따르면서 힘든 일이 많긴 하지만, 그분의 치유와 위로가 주는 좋은 시간도 그만큼 많아. 우리도 그걸 완전 넉넉하게 받고 있거든.</w:t>
             </w:r>
           </w:p>
         </w:tc>
@@ -329,7 +329,7 @@
               <w:rPr>
                 <w:sz w:val="18"/>
               </w:rPr>
-              <w:t>When we go through hard times for Jesus, it's actually for your benefit, so you can be saved. And when we're doing good, that's for you too, to keep you going and not give up. Your struggles are our struggles. When we see you guys sticking it out through the hard times, just like you enjoy the good times, we know you're gonna be alright. No doubt.</w:t>
+              <w:t>When we go through hard times for Jesus, it works out for your healing and salvation. And when we're treated well — getting a helping hand and an encouraging word — that works out for your benefit too, spurring you on, face forward, unflinching. Your struggles are our struggles. When we see you guys sticking it out through the hard times, just like you enjoy the good times, we know you're gonna be alright. No doubt.</w:t>
             </w:r>
           </w:p>
         </w:tc>
@@ -400,7 +400,7 @@
               <w:rPr>
                 <w:sz w:val="18"/>
               </w:rPr>
-              <w:t>We gotta tell you, it was rough for us in Asia. We seriously thought we were done for, like we were on death row. But it turned out to be a good thing. Instead of relying on ourselves, we had to put all our trust in God. And since he's the one who can raise the dead, that's a pretty solid plan. He saved us from what looked like certain doom, and he'll do it again, as many times as we need. And you guys were a part of it too, with your prayers. We don't want you to forget that. We can just imagine you all, cheering for us and thanking God for getting us through it. Your prayers were a huge part of our rescue mission.</w:t>
+              <w:t>We gotta tell you, it was rough for us in Asia. We seriously thought we were done for, like we were on death row, like it was all over for us. But it turned out to be a good thing. Instead of relying on our own strength or smarts, we had to put all our trust in God. And since he's the one who can raise the dead, that's a pretty solid plan. He saved us from what looked like certain doom, and he'll do it again, as many times as we need. And you guys were a part of it too, with your prayers. We don't want you to forget that. We can just imagine you all, cheering for us and thanking God for getting us through it. Your prayers were a huge part of our rescue mission.</w:t>
             </w:r>
           </w:p>
         </w:tc>
@@ -613,7 +613,7 @@
               <w:rPr>
                 <w:sz w:val="18"/>
               </w:rPr>
-              <w:t>So now you're gonna say I'm a flip-flopper because things changed? You think I say one thing and do another? Nah, that's not me. I try to be as real as God is. We didn't give you a half-hearted 'yes' and then a 'whatever' 'no'. When Silas, Timothy, and I told you about the Son of God—Jesus, was there any doubt? It was a solid 'yes'!</w:t>
+              <w:t>So now you're gonna say I'm a flip-flopper because things changed? You think I talk out of both sides of my mouth—a glib 'yes' one moment and a glib 'no' the next? Nah, that's not me. I try to be as real as God is. We didn't give you a half-hearted 'yes' and then a 'whatever' 'no'. When Silas, Timothy, and I told you about the Son of God—Jesus, how could there be any doubt? It was a solid 'yes'!</w:t>
             </w:r>
           </w:p>
         </w:tc>
@@ -755,7 +755,7 @@
               <w:rPr>
                 <w:sz w:val="18"/>
               </w:rPr>
-              <w:t>So, you wanna know the real reason I didn't come to Corinth? I swear to God, it was to spare you any more drama. I was trying to be cool, not a bully.</w:t>
+              <w:t>So, you wanna know the real reason I didn't come to Corinth? I swear to God, it was to spare you any more drama. I was looking out for you, not indifferent, not trying to manipulate you.</w:t>
             </w:r>
           </w:p>
         </w:tc>
@@ -826,7 +826,7 @@
               <w:rPr>
                 <w:sz w:val="18"/>
               </w:rPr>
-              <w:t>We're not trying to be your bosses and tell you how to live your faith. We're in this with you, and we're excited to see what God does. We know you've got your own faith, and that's what matters.</w:t>
+              <w:t>We're not trying to run your faith for you, looking over your shoulders, suspiciously critical. We're partners, working alongside you, joyfully expectant, and we're excited to see what God does. We know you've got your own faith, and that's what matters.</w:t>
             </w:r>
           </w:p>
         </w:tc>
@@ -964,7 +964,7 @@
               <w:rPr>
                 <w:sz w:val="18"/>
               </w:rPr>
-              <w:t>Hey, so I decided not to roll through again and make things awkward for everyone. Like, if I showed up and it was all tense, how could you guys even make me feel better?</w:t>
+              <w:t>Hey, so I decided not to roll through again and make things awkward for everyone. Like, if I showed up and put you in an embarrassingly painful spot, how could you then be free to cheer me up and refresh me?</w:t>
             </w:r>
           </w:p>
         </w:tc>
@@ -1035,7 +1035,7 @@
               <w:rPr>
                 <w:sz w:val="18"/>
               </w:rPr>
-              <w:t>That's why I sent that letter instead of just showing up. I didn't want to have a bummer of a time with the very people I was hoping would hype me up. I was sure that what was good for me was good for you. Honestly, writing that letter was rough. More tears than ink, for real. But I wasn't trying to start drama. I wrote it so you'd know how much I've got your backs. For real, it's all love.</w:t>
+              <w:t>That's why I sent that letter instead of just showing up. I didn't want to have a bummer of a time with the very people I was hoping would hype me up. I was sure that what was good for me was good for you. Honestly, writing that letter was rough. More tears than ink, for real. But I wasn't trying to start drama. I wrote it so you'd know how much I care — no, more than care, I *love* you.</w:t>
             </w:r>
           </w:p>
         </w:tc>
@@ -1311,7 +1311,7 @@
               <w:rPr>
                 <w:sz w:val="18"/>
               </w:rPr>
-              <w:t>When I got to Troas to spread the word about Jesus, it was wide open. God had opened the door for me. But when I didn't see my boy Titus there with an update on you guys, I couldn't chill. I was worried about you, so I bounced and went to Macedonia to find him and get some good news. And I did, thank God!</w:t>
+              <w:t>When I got to Troas to spread the Message of the Messiah, it was wide open. God had opened the door for me. But when I didn't see my boy Titus there with an update on you guys, I couldn't chill. I was worried about you, so I bounced and went to Macedonia to find him and get some good news. And I did, thank God!</w:t>
             </w:r>
           </w:p>
         </w:tc>
@@ -1382,7 +1382,7 @@
               <w:rPr>
                 <w:sz w:val="18"/>
               </w:rPr>
-              <w:t>In Jesus, God leads us in a never-ending victory parade. Through us, he spreads the knowledge of Christ. Everywhere we go, people breathe in the amazing fragrance. Because of Christ, we give off a sweet scent rising to God. To those on the way to salvation, it's an aroma full of life. But to those on the way to destruction, we smell like a rotting corpse.</w:t>
+              <w:t>In the Messiah, in Christ, God leads us in a never-ending victory parade. Through us, he spreads the knowledge of Christ. Everywhere we go, people breathe in the amazing fragrance. Because of Christ, we give off a sweet scent rising to God. To those on the way to salvation, it's an aroma full of life. But to those on the way to destruction, we smell like a rotting corpse.</w:t>
             </w:r>
           </w:p>
         </w:tc>
@@ -1591,7 +1591,7 @@
               <w:rPr>
                 <w:sz w:val="18"/>
               </w:rPr>
-              <w:t>Hey, are we trying to flex on you? Like we're bragging about how awesome we are? Nah, that's not it at all. We don't need some fancy recommendation letter to prove we're legit. You guys are our living proof. Your lives are like an open book that anyone can read, and Christ himself is the author. He didn't write on paper, but on your hearts with the Spirit of God—and we publish it for everyone to see. That's the real deal.</w:t>
+              <w:t>Hey, are we patting ourselves on the back here? Flashing our credentials, pulling rank? Nah, that's not it at all. We don't need letters of recommendation — not from you, not for you either. You guys are our living proof. Your lives are like an open book that anyone can read, and Christ himself is the author. He didn't write with ink but with God's living Spirit — not chiseled into stone but carved into human lives — and we publish it for everyone to see. That's the real deal.</w:t>
             </w:r>
           </w:p>
         </w:tc>
@@ -1614,7 +1614,7 @@
               <w:rPr>
                 <w:sz w:val="18"/>
               </w:rPr>
-              <w:t>이게 우리가 자화자찬하는 것처럼 들려? 자격증이라도 있는 양 권위를 내세우는 것 같아? 전혀 아냐. 우리는 너희에게 줄 추천서도, 너희에게 받을 추천서도 필요 없어. 너희 자체가 우리가 필요한 추천서거든. 너희 삶 자체가 누구나 보기만 해도 읽을 수 있는 편지야. 그리스도께서 직접 쓰신 거지. 잉크가 아니라 살아계신 하나님의 영으로, 돌에 새긴 게 아니라 사람의 삶에 새기셨어. 그리고 우리는 그 편지를 배달하는 사람들이야.</w:t>
+              <w:t>이게 우리가 자화자찬하는 것처럼 들려? 자격증이라도 있는 양 권위를 내세우는 것 같아? 전혀 아냐. 우리는 너희에게 줄 추천서도, 너희에게 받을 추천서도 필요 없어. 너희 자체가 우리가 필요한 추천서거든. 너희 삶 자체가 누구나 보기만 해도 읽을 수 있는 편지야. 그리스도께서 직접 쓰신 거지. 잉크가 아니라 살아계신 하나님의 영으로, 돌에 새긴 게 아니라 사람의 삶에 새기셨어. 그리고 우리가 그걸 세상에 공개하는 거야.</w:t>
             </w:r>
           </w:p>
         </w:tc>
@@ -1662,7 +1662,7 @@
               <w:rPr>
                 <w:sz w:val="18"/>
               </w:rPr>
-              <w:t>For real, we're super confident about this. You are our letter of recommendation, written by Christ for God. We could never write something like that about ourselves. Only God can do that. He's the one who gave us the hookup to this new way of life. It's not some boring rulebook that kills your vibe. It's the Spirit writing on our spirits—his life on our lives. A total life-changer.</w:t>
+              <w:t>For real, we're super confident about this. You are our letter of recommendation, written by Christ for God. We could never write something like that about ourselves. Only God can do that. He's the one who gave us the hookup to this new way of life. It's not some ink-on-paper plan with pages of legal fine print that kills your spirit. It's the Spirit writing on our spirits—his life on our lives. A total life-changer.</w:t>
             </w:r>
           </w:p>
         </w:tc>
@@ -1796,7 +1796,7 @@
               <w:rPr>
                 <w:sz w:val="18"/>
               </w:rPr>
-              <w:t>The old way, the law of Moses, was like the OG rules. When Moses brought down the stone tablets, his face had an incredible glow. It was so bright that people couldn't even look at him. But that was just a temporary glow. The new way, the way of the Spirit, is a permanent, next-level change.</w:t>
+              <w:t>The Government of Death — its constitution chiseled on stone tablets — had a dazzling inaugural. When Moses brought down the stone tablets, his face had an incredible glow. It was so bright that the people of Israel could no more look right at him than stare into the sun. But that was just a temporary glow. The Government of Living Spirit, though, is a permanent, next-level change. How much more dazzling, then, the Government of Living Spirit?</w:t>
             </w:r>
           </w:p>
         </w:tc>
@@ -1819,7 +1819,7 @@
               <w:rPr>
                 <w:sz w:val="18"/>
               </w:rPr>
-              <w:t>옛 방식, 모세의 율법은 완전 구시대 룰 같은 거야. 모세가 돌판을 가져왔을 때, 그의 얼굴은 엄청나게 빛났어. 사람들이 그를 똑바로 쳐다볼 수 없을 정도였지. 근데 그건 잠깐의 빛이었어. 새 방식, 성령의 방식은 영원한 차원이 다른 변화야.</w:t>
+              <w:t>죽음의 정부 — 헌법을 돌판에 새긴 — 는 화려하게 출범했어. 모세가 돌판을 가져왔을 때, 그의 얼굴은 엄청나게 빛났어. 이스라엘 백성이 태양을 똑바로 쳐다볼 수 없듯이 그를 똑바로 볼 수 없을 정도였지. 근데 그건 잠깐의 빛이었어. 생명의 성령의 정부는 영원히 이어지는 차원이 다른 변화야. 얼마나 더 눈부시겠어, 생명의 성령의 정부가!</w:t>
             </w:r>
           </w:p>
         </w:tc>
@@ -1938,7 +1938,7 @@
               <w:rPr>
                 <w:sz w:val="18"/>
               </w:rPr>
-              <w:t>Because we have this awesome hope, we're not holding anything back. We're not like Moses who had to hide his fading glory. We're putting it all out there. The people back then were clueless. They couldn't see that the old way was losing its power. Even now, when they read the old rules, it's like they're wearing a blindfold. Only Christ can take off the blindfold and show them that the old way is obsolete.</w:t>
+              <w:t>Because we have this awesome hope, we're not holding anything back. We're not like Moses who had to hide his fading glory. We're putting it all out there. They didn't notice it then, and they don't notice it now — don't notice there's nothing left behind that veil. Even now, when the proclamations of that old, bankrupt government are read out, it's like they're wearing a blindfold. Only Christ can take off the blindfold and show them that the old way is obsolete.</w:t>
             </w:r>
           </w:p>
         </w:tc>
@@ -1961,7 +1961,7 @@
               <w:rPr>
                 <w:sz w:val="18"/>
               </w:rPr>
-              <w:t>이런 멋진 희망이 있으니까, 우리는 아무것도 숨기지 않아. 영광이 사라져 가는 걸 가려야 했던 모세와는 달라. 우리는 모든 걸 다 드러내. 그때 사람들은 몰랐어. 옛 방식이 힘을 잃어가고 있다는 걸 보지 못했지. 지금도 옛 규칙을 읽을 때는 눈가리개를 한 것처럼 못 봐. 오직 그리스도만이 그 눈가리개를 벗겨서 옛 방식이 쓸모없다는 걸 보여주실 수 있어.</w:t>
+              <w:t>이런 멋진 희망이 있으니까, 우리는 아무것도 숨기지 않아. 영광이 사라져 가는 걸 가려야 했던 모세와는 달라. 우리는 모든 걸 다 드러내. 그때도 몰랐고, 지금도 몰라. 베일 뒤에 아무것도 남지 않았다는 걸 못 봐. 지금도 그 옛 파산한 정부의 선언문을 읽을 때는 눈가리개를 한 것처럼 못 봐. 오직 그리스도만이 그 눈가리개를 벗겨서 옛 방식이 쓸모없다는 걸 보여주실 수 있어.</w:t>
             </w:r>
           </w:p>
         </w:tc>
@@ -2009,7 +2009,7 @@
               <w:rPr>
                 <w:sz w:val="18"/>
               </w:rPr>
-              <w:t>But whenever someone turns to God, He takes away the blindfold and they can see Him face-to-face. They realize that God is not some carved-up stone but a living, personal God. And when God's Spirit is personally present with you, the old rules don't matter anymore. We're free! There's nothing between us and God. Our faces are shining with His glory. We're going through a powerful shift, becoming more and more like the Messiah, Jesus, as God works in our lives.</w:t>
+              <w:t>But whenever they turn to face God as Moses did, he takes away the blindfold and they can see him face-to-face. They realize that God is not some carved-up stone but a living, personal God. And when God's Spirit is personally present with you, the old rules don't matter anymore. We're free of it! All of us! There's nothing between us and God. Our faces are shining with His glory. We're going through a powerful shift, our lives gradually becoming brighter and more beautiful as God enters our lives and we become like the Messiah.</w:t>
             </w:r>
           </w:p>
         </w:tc>
@@ -2032,7 +2032,7 @@
               <w:rPr>
                 <w:sz w:val="18"/>
               </w:rPr>
-              <w:t>하지만 누군가 하나님께로 돌아서기만 하면, 그분이 눈가리개를 벗겨주셔서 얼굴과 얼굴을 마주하게 돼. 그들은 하나님이 돌에 새긴 조각상이 아니라, 살아계신 인격적인 분이라는 걸 깨닫게 돼. 하나님의 영이 친히 함께하시면, 옛 규칙은 더 이상 중요하지 않아. 우리는 자유야! 우리와 하나님 사이에 아무것도 없어. 우리 얼굴은 그분의 영광으로 환하게 빛나. 하나님이 우리 삶에 들어오시고 우리가 그분을 닮아가면서, 우리는 메시아이신 예수님을 닮아가는 강력한 변화를 겪고 있어.</w:t>
+              <w:t>하지만 모세처럼 하나님께로 얼굴을 돌리기만 하면, 그분이 눈가리개를 벗겨주셔서 얼굴과 얼굴을 마주하게 돼. 그들은 하나님이 돌에 새긴 조각상이 아니라, 살아계신 인격적인 분이라는 걸 깨닫게 돼. 하나님의 영이 친히 함께하시면, 옛 규칙은 더 이상 중요하지 않아. 우리는 자유야, 우리 모두! 우리와 하나님 사이에 아무것도 없어. 우리 얼굴은 그분의 영광으로 환하게 빛나. 하나님이 우리 삶에 들어오시고 우리가 그분을 닮아가면서, 메시아를 닮아 우리 삶은 점점 더 밝고 아름다워져.</w:t>
             </w:r>
           </w:p>
         </w:tc>
@@ -2423,7 +2423,7 @@
               <w:rPr>
                 <w:sz w:val="18"/>
               </w:rPr>
-              <w:t>If you only look at us, you might miss the main event. We're just ordinary guys, like clay pots holding this amazing treasure. That's so nobody gets it twisted and thinks we're the ones with the power. And let's be real, there's no chance of that. We get roughed up and surrounded by problems, but we don't give up. We get confused, but we know God's got the answers. We've been scared out of our minds, but God never abandoned us. We get knocked down, but we're not out. They're doing the same stuff to us that they did to Jesus—mocking us, trying to shut us down—but the same power that raised Jesus is alive in us. We're constantly in danger for Jesus, which just makes his life shine even brighter through us. So while we're going through it, you're getting the benefits.</w:t>
+              <w:t>If you only look at us, you might miss the main event. We're just ordinary guys, like clay pots holding this amazing treasure. That's so nobody gets it twisted and thinks we're the ones with the power. And let's be real, there's no chance of that. We get roughed up and surrounded by problems, but we don't give up. We get confused, but we know God's got the answers. We've been scared out of our minds, but God never abandoned us. We get knocked down, but we're not out. They're doing the same stuff to us that they did to Jesus—trial and torture, mockery and murder—but the same power that raised Jesus is alive in us. We're constantly in danger for Jesus, which just makes his life shine even brighter through us. So while we're going through it, you're getting the benefits.</w:t>
             </w:r>
           </w:p>
         </w:tc>
@@ -2494,7 +2494,7 @@
               <w:rPr>
                 <w:sz w:val="18"/>
               </w:rPr>
-              <w:t>We're not keeping this a secret. Just like the guy in the Psalms who said, "I believed it, so I said it," we're shouting what we believe from the rooftops. And we believe that the same God who brought Jesus back to life will do the same for us, and we'll all be together. Everything that happens is for your benefit and for God's glory. More grace, more people, more praise!</w:t>
+              <w:t>We're not keeping this a secret. Just like the guy in the Psalms who said, "I believed it, so I said it," we're shouting what we believe from the rooftops. And we believe that the same God who brought Jesus back to life will just as surely raise us up with you, alive. Everything that happens is for your benefit and for God's glory. More grace, more people, more praise!</w:t>
             </w:r>
           </w:p>
         </w:tc>
@@ -2703,7 +2703,7 @@
               <w:rPr>
                 <w:sz w:val="18"/>
               </w:rPr>
-              <w:t>Hey, so check it. We know that our bodies are basically like old, beat-up tents. One day, we're gonna pack 'em up and trade 'em in for brand-new resurrection bodies in heaven. These aren't some cheap, handmade things; they're custom-built by God himself, and we'll never have to move again. It's like upgrading from a leaky tent to a sick mansion. Sometimes we can't wait to move out, and we get super frustrated with our current setup. Living here is like crashing in a bare-bones shack compared to what's coming. We're over it! God's given us a sneak peek of the real deal, our forever home, and these awesome new bodies. The Holy Spirit is like a trailer for the new life that gets us hyped for what's next. He's put a little bit of heaven in our hearts so we'll never settle for less.</w:t>
+              <w:t>Hey, so check it. We know that our bodies are basically like old, beat-up tents. One day, we're gonna pack 'em up and trade 'em in for brand-new resurrection bodies in heaven. These aren't some cheap, handmade things; they're custom-built by God himself, and we'll never have to move again. Sometimes we can't wait to move out, and we get super frustrated with our current setup. Living here is like crashing in a bare-bones shack compared to what's coming. We're over it! God's given us a sneak peek of the real deal, our forever home, and these awesome new bodies. The Holy Spirit is like a trailer for the new life that gets us hyped for what's next. He's put a little bit of heaven in our hearts so we'll never settle for less.</w:t>
             </w:r>
           </w:p>
         </w:tc>
@@ -2726,7 +2726,7 @@
               <w:rPr>
                 <w:sz w:val="18"/>
               </w:rPr>
-              <w:t>자, 들어봐. 우리 몸은 기본적으로 낡고 해진 텐트 같은 거라는 걸 우리는 알아. 언젠가는 그걸 접어서 하늘에 있는 새 부활 몸으로 갈아탈 거야. 싸구려 수제품이 아냐. 하나님이 직접 맞춤 제작하신 거고, 다시는 이사 안 해도 돼. 새는 텐트에서 끝내주는 저택으로 업그레이드하는 거지. 가끔은 이사 가고 싶어서 미칠 것 같고, 지금 상태에 완전 좌절하기도 해. 앞으로 올 것에 비하면 지금 사는 건 가구도 없는 오두막에 잠깐 얹혀사는 것 같거든. 완전 지긋지긋해! 하나님이 진짜배기, 우리 영원한 집, 이 멋진 새 몸들을 살짝 보여주셨거든. 성령님은 앞으로 올 새 삶을 미리 보여주는 예고편 같은 분이야. 그분이 우리 마음에 천국을 조금 넣어두셔서, 우리가 어설픈 것에 만족하지 않게 하시는 거야.</w:t>
+              <w:t>자, 들어봐. 우리 몸은 기본적으로 낡고 해진 텐트 같은 거라는 걸 우리는 알아. 언젠가는 그걸 접어서 하늘에 있는 새 부활 몸으로 갈아탈 거야. 싸구려 수제품이 아냐. 하나님이 직접 맞춤 제작하신 거고, 다시는 이사 안 해도 돼. 가끔은 이사 가고 싶어서 미칠 것 같고, 지금 상태에 완전 좌절하기도 해. 앞으로 올 것에 비하면 지금 사는 건 가구도 없는 오두막에 잠깐 얹혀사는 것 같거든. 완전 지긋지긋해! 하나님이 진짜배기, 우리 영원한 집, 이 멋진 새 몸들을 살짝 보여주셨거든. 성령님은 앞으로 올 새 삶을 미리 보여주는 예고편 같은 분이야. 그분이 우리 마음에 천국을 조금 넣어두셔서, 우리가 어설픈 것에 만족하지 않게 하시는 거야.</w:t>
             </w:r>
           </w:p>
         </w:tc>
@@ -2845,7 +2845,7 @@
               <w:rPr>
                 <w:sz w:val="18"/>
               </w:rPr>
-              <w:t>But it's not just about getting to heaven. The main thing is making God happy, no matter what's going on. Sooner or later, we're all gonna have to stand before God for a final review. We'll show up in front of Christ and get what we deserve for everything we've done, good or bad.</w:t>
+              <w:t>But it's not about whether we're stuck in exile or home in heaven — The main thing is making God happy, no matter what's going on. Sooner or later, we're all gonna have to stand before God for a final review. We'll show up in front of Christ and get what we deserve for everything we've done, good or bad.</w:t>
             </w:r>
           </w:p>
         </w:tc>
@@ -2868,7 +2868,7 @@
               <w:rPr>
                 <w:sz w:val="18"/>
               </w:rPr>
-              <w:t>하지만 천국 가는 것만이 다가 아냐. 핵심은 어떤 상황에서든 하나님을 기쁘시게 하는 거야. 그게 우리가 노리는 거야. 조만간 우리는 어떤 처지든 하나님을 마주하게 될 거야. 우리는 그리스도 앞에 나타나서, 우리가 한 일대로 좋은 것이든 나쁜 것이든 받게 될 거야.</w:t>
+              <w:t>하지만 망명 중이든 천국 집에 돌아가든, 그게 다가 아냐. 핵심은 어떤 상황에서든 하나님을 기쁘시게 하는 거야. 그게 우리가 노리는 거야. 조만간 우리는 어떤 처지든 하나님을 마주하게 될 거야. 우리는 그리스도 앞에 나타나서, 우리가 한 일대로 좋은 것이든 나쁜 것이든 받게 될 거야.</w:t>
             </w:r>
           </w:p>
         </w:tc>
@@ -3551,7 +3551,7 @@
               <w:rPr>
                 <w:sz w:val="18"/>
               </w:rPr>
-              <w:t>For real, my Corinthian bros, I'm trying to tell you that you can have this big, awesome life too. We're not the ones holding you back. You're holding yourselves back. Your lives are meant to be huge, but you're living small. I'm just being straight with you because I care. Open up your lives! Live big!</w:t>
+              <w:t>For real, my Corinthian bros, I can't even tell you how badly I want you to step into this wide-open, spacious life. We're not the ones holding you back. You're holding yourselves back. Your lives are meant to be huge, but you're living small. I'm just being straight with you because I care. Open up your lives! Live big!</w:t>
             </w:r>
           </w:p>
         </w:tc>
@@ -3574,7 +3574,7 @@
               <w:rPr>
                 <w:sz w:val="18"/>
               </w:rPr>
-              <w:t>진짜로, 고린도 친구들아, 너희도 이 크고 멋진 삶을 누릴 수 있다는 걸 말해주고 싶어. 우리가 너희를 막는 게 아냐. 너희가 스스로를 막고 있는 거야. 너희 삶은 크게 살라고 있는 건데, 너희는 작게 살고 있어. 너희를 아끼니까 솔직하게 말하는 거야. 너희 삶을 열어! 크게 살아!</w:t>
+              <w:t>진짜로, 고린도 친구들아, 너희가 이 탁 트이고 넓은 삶에 들어서길 얼마나 간절히 바라는지 말로 다 못 하겠어. 우리가 너희를 막는 게 아냐. 너희가 스스로를 막고 있는 거야. 너희 삶은 크게 살라고 있는 건데, 너희는 작게 살고 있어. 너희를 아끼니까 솔직하게 말하는 거야. 너희 삶을 열어! 크게 살아!</w:t>
             </w:r>
           </w:p>
         </w:tc>
@@ -3630,7 +3630,7 @@
               <w:rPr>
                 <w:sz w:val="18"/>
               </w:rPr>
-              <w:t>And for real, don't team up with people who don't mess with God. How can you mix good and bad? That's not a team, that's a war. Can light and darkness be best friends? Does Jesus Christ hang out with the Devil? Can you trust someone who doesn't trust in God? You wouldn't put a fake idol in God's temple, right? Well, you are God's temple. God lives in you. He said it himself:</w:t>
+              <w:t>And for real, don't team up with people who don't mess with God. How can you mix good and bad? That's not a team, that's a war. Can light and darkness be best friends? Does Jesus Christ hang out with the Devil? Can trust and mistrust hold hands? You wouldn't put a fake idol in God's temple, right? Well, that's exactly what we are — each of us is a temple, and God lives in us. He said it himself:</w:t>
             </w:r>
           </w:p>
         </w:tc>
@@ -3653,7 +3653,7 @@
               <w:rPr>
                 <w:sz w:val="18"/>
               </w:rPr>
-              <w:t>그리고 진짜로, 하나님 안 믿는 사람들이랑 팀 먹지 마. 옳은 것과 그른 게 어떻게 섞이겠어? 그건 팀이 아니라 전쟁이야. 빛이 어둠이랑 베프가 될 수 있어? 예수님이 악마랑 어울려 다녀? 하나님을 안 믿는 사람을 믿을 수 있어? 하나님의 성전에 가짜 우상을 갖다 놓진 않겠지? 근데 그게 바로 너희 모습이야. 너희가 하나님의 성전이거든. 하나님이 너희 안에 사셔. 그분이 직접 말씀하셨어.</w:t>
+              <w:t>그리고 진짜로, 하나님 안 믿는 사람들이랑 팀 먹지 마. 옳은 것과 그른 게 어떻게 섞이겠어? 그건 팀이 아니라 전쟁이야. 빛이 어둠이랑 베프가 될 수 있어? 예수님이 악마랑 어울려 다녀? 믿음과 불신이 손잡을 수 있어? 하나님의 성전에 가짜 우상을 갖다 놓진 않겠지? 근데 그게 바로 우리 모습이야. 우리 한 사람 한 사람이 하나님의 성전이거든. 하나님이 우리 안에 사셔. 그분이 직접 말씀하셨어.</w:t>
             </w:r>
           </w:p>
         </w:tc>
@@ -3973,7 +3973,7 @@
               <w:rPr>
                 <w:sz w:val="18"/>
               </w:rPr>
-              <w:t>Seriously, trust us. We've never scammed or taken advantage of anyone. I'm not trying to call you out. I've told you before, I'm your biggest fan, ride or die. I'm so proud of you guys it's not even funny. Even with all the drama we've been through, thinking about you just makes me happy.</w:t>
+              <w:t>Seriously, trust us. We've never hurt or scammed anyone, never taken advantage of anyone. I'm not trying to call you out. I've told you before, I'm your biggest fan, ride or die. I'm so proud of you guys it's not even funny. Even with all the drama we've been through, thinking about you just makes me happy.</w:t>
             </w:r>
           </w:p>
         </w:tc>
@@ -3996,7 +3996,7 @@
               <w:rPr>
                 <w:sz w:val="18"/>
               </w:rPr>
-              <w:t>진짜로, 우리를 믿어줘. 우리는 아무도 속이거나 이용한 적 없어. 너희 흠 잡으려는 게 아냐. 전에 말했듯이 나는 너희 열혈 팬이야, 끝까지 함께할 거야. 너희가 너무 자랑스러워서 말로 다 못 해. 온갖 드라마를 겪었는데도, 너희 생각만 하면 기뻐.</w:t>
+              <w:t>진짜로, 우리를 믿어줘. 우리는 아무도 해치거나 속인 적 없고, 이용한 적도 없어. 너희 흠 잡으려는 게 아냐. 전에 말했듯이 나는 너희 열혈 팬이야, 끝까지 함께할 거야. 너희가 너무 자랑스러워서 말로 다 못 해. 온갖 드라마를 겪었는데도, 너희 생각만 하면 기뻐.</w:t>
             </w:r>
           </w:p>
         </w:tc>
@@ -4044,7 +4044,7 @@
               <w:rPr>
                 <w:sz w:val="18"/>
               </w:rPr>
-              <w:t>When we first rolled into Macedonia, we were totally stressed. There was drama in the church, and we were panicking. We couldn't chill because we had no idea what was going to happen. But then God, who's the ultimate hype man for anyone feeling down, sent Titus to us, and it was a total game-changer. Just seeing him was cool, but the real W was hearing what he said about you guys: how you were all-in, how you felt bad about the situation, and how you had my back. I went from being a wreck to totally chill in like, five seconds.</w:t>
+              <w:t>When we first rolled into Macedonia, we were totally stressed. There was drama in the church, and we were panicking. We couldn't chill because we had no idea what was going to happen. But then God, who's the ultimate hype man for anyone feeling down, sent Titus, and just like that our heads and hearts were lifted — total game-changer. Just seeing him was cool, but the real W was hearing what he said about you guys: how you were all-in, how you felt bad about the situation, and how you had my back. I went from being a wreck to totally chill in like, five seconds.</w:t>
             </w:r>
           </w:p>
         </w:tc>
@@ -4067,7 +4067,7 @@
               <w:rPr>
                 <w:sz w:val="18"/>
               </w:rPr>
-              <w:t>마케도니아에 처음 갔을 때, 우리는 완전 스트레스였어. 교회 안에 드라마가 있었고, 우리는 패닉 상태였거든. 무슨 일이 일어날지 몰라서 쉴 수가 없었지. 그러다 낙심한 사람의 최고의 응원자인 하나님이 디도를 보내주셨어. 완전 게임 체인저였지. 디도를 보는 것만으로도 좋았지만, 진짜 승리는 그가 전한 너희 소식이었어. 너희가 얼마나 올인했는지, 상황을 얼마나 안타까워했는지, 나를 얼마나 지켜줬는지 말야. 나는 5초 만에 멘붕에서 완전 평온으로 바뀌었어.</w:t>
+              <w:t>마케도니아에 처음 갔을 때, 우리는 완전 스트레스였어. 교회 안에 드라마가 있었고, 우리는 패닉 상태였거든. 무슨 일이 일어날지 몰라서 쉴 수가 없었지. 그러다 낙심한 사람의 최고의 응원자인 하나님이 디도를 보내주셨어. 그걸로 우리 고개와 마음이 들렸어 — 완전 게임 체인저였지. 디도를 보는 것만으로도 좋았지만, 진짜 승리는 그가 전한 너희 소식이었어. 너희가 얼마나 올인했는지, 상황을 얼마나 안타까워했는지, 나를 얼마나 지켜줬는지 말야. 나는 5초 만에 멘붕에서 완전 평온으로 바뀌었어.</w:t>
             </w:r>
           </w:p>
         </w:tc>
@@ -4115,7 +4115,7 @@
               <w:rPr>
                 <w:sz w:val="18"/>
               </w:rPr>
-              <w:t>Look, I know my last letter was harsh and probably made you feel terrible. I felt bad about it for a minute, but now I see it was for the best. It was a wake-up call. I'm not glad you were upset, but I'm stoked that it made you turn things around and get right with God. It was a total win.</w:t>
+              <w:t>Look, I know my last letter was harsh and probably made you feel terrible. I felt bad about it for a minute, but now I see it was for the best. It was a wake-up call. I'm not glad you were upset — but only for a while. I'm stoked that it made you turn toward God instead of away from him — all gain, no loss. It was a total win.</w:t>
             </w:r>
           </w:p>
         </w:tc>
@@ -4138,7 +4138,7 @@
               <w:rPr>
                 <w:sz w:val="18"/>
               </w:rPr>
-              <w:t>봐, 내 지난 편지가 독했고 너희를 힘들게 했을 거라는 거 알아. 잠깐은 미안했지만, 이제 보니 최선이었어. 정신 차리게 하는 일격이었지. 너희가 괴로워서 기쁜 게 아니라, 그걸로 방향을 틀고 하나님과 바로잡게 돼서 신나. 완전 승리였어.</w:t>
+              <w:t>봐, 내 지난 편지가 독했고 너희를 힘들게 했을 거라는 거 알아. 잠깐은 미안했지만, 이제 보니 최선이었어. 정신 차리게 하는 일격이었지. 너희가 괴로워서 기쁜 게 아니라 — 잠깐이었지만 — 그걸로 하나님을 향해 돌아서고 멀어지지 않게 돼서 신나. 얻은 건 다 얻고 잃은 건 하나도 없어. 완전 승리였어.</w:t>
             </w:r>
           </w:p>
         </w:tc>
@@ -4186,7 +4186,7 @@
               <w:rPr>
                 <w:sz w:val="18"/>
               </w:rPr>
-              <w:t>Feeling bad in a way that pushes you toward God is a good thing. It's a powerful shift for your soul. You never regret that kind of pain. But when you let tough times push you away from God, you just end up with a life full of regrets, which is a dead end.</w:t>
+              <w:t>Feeling bad in a way that pushes you toward God is a good thing. It puts us back on the road to salvation. You never regret that kind of pain. But when you let tough times push you away from God, you just end up with a life full of regrets, which is a dead end.</w:t>
             </w:r>
           </w:p>
         </w:tc>
@@ -4209,7 +4209,7 @@
               <w:rPr>
                 <w:sz w:val="18"/>
               </w:rPr>
-              <w:t>너희를 하나님께로 이끄는 괴로움은 좋은 거야. 영혼의 강력한 전환점이지. 그런 아픔은 절대 후회하지 않아. 하지만 힘든 시간이 하나님에게서 멀어지게 두면, 후회로 가득 찬 인생으로 끝나. 그건 막다른 길이야.</w:t>
+              <w:t>너희를 하나님께로 이끄는 괴로움은 좋은 거야. 구원의 길로 다시 들어서게 해주거든. 그런 아픔은 절대 후회하지 않아. 하지만 힘든 시간이 하나님에게서 멀어지게 두면, 후회로 가득 찬 인생으로 끝나. 그건 막다른 길이야.</w:t>
             </w:r>
           </w:p>
         </w:tc>
@@ -4529,7 +4529,7 @@
               <w:rPr>
                 <w:sz w:val="18"/>
               </w:rPr>
-              <w:t>Hey, check it out. I gotta tell you about the surprising, generous ways God's been working in the Macedonian churches. They've been going through some majorly tough times, like, seriously pushed to their limits. But it's in the middle of all that chaos that their true colors showed, and man, did they shine. They were super happy, even though they were broke. And here's the thing—the pressure made them do something totally unexpected. They started giving like crazy, just pure, generous hearts. I was there, I saw it. They gave everything they could, and then some, begging for the chance to help out other Christians who were struggling.</w:t>
+              <w:t>Hey, check it out. I gotta tell you about the surprising, generous ways God's been working in the Macedonian churches. They've been going through some majorly tough times, like, seriously pushed to their limits. But it's in the middle of all that chaos that their true colors showed, and man, did they shine. They were super happy, even though they were broke. And here's the thing—the pressure made them do something totally unexpected. They started giving like crazy, just pure, generous hearts. I was there, I saw it. They gave everything they could, and then some, begging for the privilege of helping out other Christians who were struggling.</w:t>
             </w:r>
           </w:p>
         </w:tc>
@@ -4552,7 +4552,7 @@
               <w:rPr>
                 <w:sz w:val="18"/>
               </w:rPr>
-              <w:t>자, 들어봐. 하나님이 마케도니아 교회들에서 놀랍고 관대하게 일하고 계신 얘기를 해줘야겠어. 걔네가 진짜 힘든 시기를 겪고 있어. 말 그대로 한계까지 몰렸지. 근데 그 혼돈 한가운데서 걔네 진짜 모습이 드러났어. 완전 빛났지. 엄청 가난했는데도 엄청 기뻐했어. 그리고 포인트는 이거야. 그 압박이 완전히 예상 밖의 일을 만들어냈어. 순수하고 관대한 마음으로 미친 듯이 나누기 시작한 거야. 내가 거기서 직접 봤어. 할 수 있는 건 다 내놓고, 그 이상까지 내놓으면서, 힘든 크리스천들을 돕는 일에 참여할 기회를 달라고 애원했어.</w:t>
+              <w:t>자, 들어봐. 하나님이 마케도니아 교회들에서 놀랍고 관대하게 일하고 계신 얘기를 해줘야겠어. 걔네가 진짜 힘든 시기를 겪고 있어. 말 그대로 한계까지 몰렸지. 근데 그 혼돈 한가운데서 걔네 진짜 모습이 드러났어. 완전 빛났지. 엄청 가난했는데도 엄청 기뻐했어. 그리고 포인트는 이거야. 그 압박이 완전히 예상 밖의 일을 만들어냈어. 순수하고 관대한 마음으로 미친 듯이 나누기 시작한 거야. 내가 거기서 직접 봤어. 할 수 있는 건 다 내놓고, 그 이상까지 내놓으면서, 힘든 크리스천들을 돕는 특권을 달라고 애원했어.</w:t>
             </w:r>
           </w:p>
         </w:tc>
@@ -4600,7 +4600,7 @@
               <w:rPr>
                 <w:sz w:val="18"/>
               </w:rPr>
-              <w:t>This wasn't some planned thing; it was all them. They totally caught us off guard. The secret? They gave themselves to God first, and then to us. The rest of the giving just flowed from that. That's why we hit up Titus to get you guys in on it, to finish what you started. You're already killing it in so many ways—you've got major faith, you're great with words, you're smart, you're passionate, and you love us. So, let's see you crush this, too.</w:t>
+              <w:t>This wasn't some planned thing; it was all them. They totally caught us off guard. The secret? They gave themselves to God first, and then to us. The rest of the giving just flowed from God's work in their lives. That's why we hit up Titus to get you guys in on it, to finish what you started. You're already killing it in so many ways—you've got major faith, you're great with words, you're smart, you're passionate, and you love us. So, let's see you crush this, too.</w:t>
             </w:r>
           </w:p>
         </w:tc>
@@ -4623,7 +4623,7 @@
               <w:rPr>
                 <w:sz w:val="18"/>
               </w:rPr>
-              <w:t>이건 누가 시켜서 한 게 아냐. 전부 걔네 생각이었어. 우리는 완전히 기습당했지. 비결은? 걔네가 먼저 자신을 하나님께 드렸고, 그 다음 우리에게 드린 거야. 나머지 나눔은 그냥 거기서 흘러나온 거였어. 그래서 우리는 디도에게 부탁해서 너희도 이 일에 동참하게 한 거야. 시작한 걸 마무리하려고 말야. 너희는 이미 많은 걸 잘하고 있잖아. 믿음도 크고, 말도 잘하고, 똑똑하고, 열정적이고, 우리를 사랑하지. 그러니까 이것도 끝내주게 해봐.</w:t>
+              <w:t>이건 누가 시켜서 한 게 아냐. 전부 걔네 생각이었어. 우리는 완전히 기습당했지. 비결은? 걔네가 먼저 자신을 하나님께 드렸고, 그 다음 우리에게 드린 거야. 나머지 나눔은 그냥 하나님께서 걔네 삶에서 일하신 데서 흘러나온 거였어. 그래서 우리는 디도에게 부탁해서 너희도 이 일에 동참하게 한 거야. 시작한 걸 마무리하려고 말야. 너희는 이미 많은 걸 잘하고 있잖아. 믿음도 크고, 말도 잘하고, 똑똑하고, 열정적이고, 우리를 사랑하지. 그러니까 이것도 끝내주게 해봐.</w:t>
             </w:r>
           </w:p>
         </w:tc>
@@ -5704,7 +5704,7 @@
               <w:rPr>
                 <w:sz w:val="18"/>
               </w:rPr>
-              <w:t>이제 개인적이지만 아주 긴급한 얘기를 할게. 그리스도의 온유하지만 단호한 영으로 쓰는 거야. 내가 너희랑 같이 있을 때는 굽실거리고 우유부단한 것처럼 그려지지만, 안전하게 멀리서 편지 쓸 때는 가혹하고 요구가 많다는 얘기를 들었어. 내가 너희랑 같이 있을 때 강경하게 나오게 만들지 마. 내가 원칙 없는 기회주의자라고 말하는 사람들에게 한순간도 주저하지 않고 맞설 거라고 생각하지 마. 그러면 걔네는 자기 말을 주워담아야 할 거야.</w:t>
+              <w:t>이제 개인적이지만 아주 긴급한 얘기를 할게. 그리스도의 온유하지만 단호한 영으로 쓰는 거야. 내가 너희랑 같이 있을 때는 굽실거리고 우유부단한 것처럼 그려지지만, 안전하게 멀리서 편지 쓸 때는 가혹하고 요구가 많다는 얘기를 들었어. 내가 너희랑 같이 있을 때 강경하게 나오게 만들지 마. 내가 원칙 없는 기회주의자라고 말하는 사람들에게 맞설 때 한순간도 주저할 거라고 생각하지 마. 그러면 걔네는 자기 말을 주워담아야 할 거야.</w:t>
             </w:r>
           </w:p>
         </w:tc>
@@ -6487,8 +6487,18 @@
             <w:r/>
             <w:r>
               <w:rPr>
+                <w:b/>
+                <w:sz w:val="16"/>
+              </w:rPr>
+              <w:t>12-15</w:t>
+            </w:r>
+          </w:p>
+          <w:p>
+            <w:r>
+              <w:rPr>
                 <w:sz w:val="18"/>
               </w:rPr>
+              <w:t>And I'm not changing my position on this. I'd die before taking your money. I'm giving nobody grounds for lumping me in with those money-grubbing "preachers," vaunting themselves as something special. They're a sorry bunch--pseudo-apostles, lying preachers, crooked workers--posing as Christ's agents but sham to the core. And no wonder! Satan does it all the time, dressing up as a beautiful angel of light. So it shouldn't surprise us when his servants masquerade as servants of God. But they're not getting by with anything. They'll pay for it in the end.</w:t>
             </w:r>
           </w:p>
         </w:tc>
@@ -6509,10 +6519,9 @@
           <w:p>
             <w:r>
               <w:rPr>
-                <w:b/>
                 <w:sz w:val="18"/>
               </w:rPr>
-              <w:t>Many a Long and Lonely Night</w:t>
+              <w:t>And I'm not changing my position on this. I'd die before taking your money. I'm giving nobody grounds for lumping me in with those money-grubbing "preachers," vaunting themselves as something special. They're a sorry bunch—pseudo-apostles, lying preachers, crooked workers—posing as Christ's agents but sham to the core. And no wonder! Satan does it all the time, dressing up as a beautiful angel of light. So it shouldn't surprise us when his servants masquerade as servants of God. But they're not getting by with anything. They'll pay for it in the end.</w:t>
             </w:r>
           </w:p>
         </w:tc>
@@ -6533,10 +6542,9 @@
           <w:p>
             <w:r>
               <w:rPr>
-                <w:b/>
                 <w:sz w:val="18"/>
               </w:rPr>
-              <w:t>길고 외로운 많은 밤</w:t>
+              <w:t>그리고 이 입장은 바꾸지 않을 거야. 너희 돈을 받느니 죽겠어. 나를 그 돈 밝히는 '설교자'들, 자기를 대단한 것처럼 뽐내는 사람들과 같은 부류로 묶을 구실을 누구에게도 주지 않을 거야. 걔네는 한심한 무리야. 가짜 사도, 거짓말쟁이 설교자, 비뚤어진 일꾼. 그리스도의 대리인인 척하지만 속은 완전히 가짜지. 놀랄 것도 없어! 사탄은 항상 그래. 아름다운 빛의 천사로 변장하거든. 그러니 그 종들이 하나님의 종으로 변장한다고 놀라지 마. 하지만 걔네는 아무것도 빠져나가지 못해. 결국 대가를 치르게 될 거야.</w:t>
             </w:r>
           </w:p>
         </w:tc>
@@ -6550,18 +6558,32 @@
             <w:r/>
             <w:r>
               <w:rPr>
+                <w:sz w:val="18"/>
+              </w:rPr>
+            </w:r>
+          </w:p>
+        </w:tc>
+        <w:tc>
+          <w:tcPr>
+            <w:tcW w:type="dxa" w:w="2880"/>
+          </w:tcPr>
+          <w:p>
+            <w:r/>
+            <w:r>
+              <w:rPr>
                 <w:b/>
                 <w:sz w:val="16"/>
               </w:rPr>
-              <w:t>12-15</w:t>
-            </w:r>
-          </w:p>
-          <w:p>
-            <w:r>
-              <w:rPr>
+              <w:t>16-21</w:t>
+            </w:r>
+          </w:p>
+          <w:p>
+            <w:r>
+              <w:rPr>
+                <w:b/>
                 <w:sz w:val="18"/>
               </w:rPr>
-              <w:t>And I'm not changing my position on this. I'd die before taking your money. I'm giving nobody grounds for lumping me in with those money-grubbing "preachers," vaunting themselves as something special. They're a sorry bunch--pseudo-apostles, lying preachers, crooked workers--posing as Christ's agents but sham to the core. And no wonder! Satan does it all the time, dressing up as a beautiful angel of light. So it shouldn't surprise us when his servants masquerade as servants of God. But they're not getting by with anything. They'll pay for it in the end.</w:t>
+              <w:t>Many a Long and Lonely Night</w:t>
             </w:r>
           </w:p>
         </w:tc>
@@ -6576,38 +6598,16 @@
                 <w:b/>
                 <w:sz w:val="16"/>
               </w:rPr>
-              <w:t>12-15</w:t>
-            </w:r>
-          </w:p>
-          <w:p>
-            <w:r>
-              <w:rPr>
+              <w:t>16-21</w:t>
+            </w:r>
+          </w:p>
+          <w:p>
+            <w:r>
+              <w:rPr>
+                <w:b/>
                 <w:sz w:val="18"/>
               </w:rPr>
-              <w:t>And I'm not changing my position on this. I'd die before taking your money. I'm giving nobody grounds for lumping me in with those money-grubbing "preachers," vaunting themselves as something special. They're a sorry bunch—pseudo-apostles, lying preachers, crooked workers—posing as Christ's agents but sham to the core. And no wonder! Satan does it all the time, dressing up as a beautiful angel of light. So it shouldn't surprise us when his servants masquerade as servants of God. But they're not getting by with anything. They'll pay for it in the end.</w:t>
-            </w:r>
-          </w:p>
-        </w:tc>
-        <w:tc>
-          <w:tcPr>
-            <w:tcW w:type="dxa" w:w="2880"/>
-          </w:tcPr>
-          <w:p>
-            <w:r/>
-            <w:r>
-              <w:rPr>
-                <w:b/>
-                <w:sz w:val="16"/>
-              </w:rPr>
-              <w:t>12-15</w:t>
-            </w:r>
-          </w:p>
-          <w:p>
-            <w:r>
-              <w:rPr>
-                <w:sz w:val="18"/>
-              </w:rPr>
-              <w:t>그리고 이 입장은 바꾸지 않을 거야. 너희 돈을 받느니 죽겠어. 나를 그 돈 밝히는 '설교자'들, 자기를 대단한 것처럼 뽐내는 사람들과 같은 부류로 묶을 구실을 누구에게도 주지 않을 거야. 걔네는 한심한 무리야. 가짜 사도, 거짓말쟁이 설교자, 비뚤어진 일꾼. 그리스도의 대리인인 척하지만 속은 완전히 가짜지. 놀랄 것도 없어! 사탄은 항상 그래. 아름다운 빛의 천사로 변장하거든. 그러니 그 종들이 하나님의 종으로 변장한다고 놀라지 마. 하지만 걔네는 아무것도 빠져나가지 못해. 결국 대가를 치르게 될 거야.</w:t>
+              <w:t>길고 외로운 많은 밤</w:t>
             </w:r>
           </w:p>
         </w:tc>
@@ -6678,7 +6678,7 @@
               <w:rPr>
                 <w:sz w:val="18"/>
               </w:rPr>
-              <w:t>처음으로 돌아가서 얘기할게. 계속 바보처럼 들려도 너무 뭐라 하지 마. 아니면 그냥 내가 바보라고 인정하고 잠깐 헛소리하게 내버려둬. 이런 말투는 그리스도에게서 배운 게 아냐. 요즘 인기 많은 서커스 설교자들에게서 배운 나쁜 버릇이야. 너희는 심판석에 앉아서 이 모든 소동을 지켜보니까, 가끔 지나가는 바보 하나쯤은 봐줄 여유가 있잖아. 너희는 사기꾼들에 대한 감탄할 만한 관용을 가졌어. 걔네는 너희 자유를 빼앗고, 돈을 뜯고, 홀랑 털어가고, 깔보고, 뺨까지 때리잖아! 인정하기 부끄럽지만, 우리 속은 그런 걸 견딜 만큼 강하지 않아.</w:t>
+              <w:t>처음으로 돌아가서 얘기할게. 계속 바보처럼 들려도 너무 뭐라 하지 마. 아니면 그냥 내가 바보라고 인정하고 잠깐 푸념 좀 하게 내버려둬. 이런 말투는 그리스도에게서 배운 게 아냐. 요즘 인기 많은 서커스 설교자들에게서 배운 나쁜 버릇이야. 너희는 심판석에 앉아서 이 모든 소동을 지켜보니까, 가끔 지나가는 바보 하나쯤은 봐줄 여유가 있잖아. 너희는 사기꾼들에 대한 감탄할 만한 관용을 가졌어. 걔네는 너희 자유를 빼앗고, 돈을 뜯고, 홀랑 털어가고, 깔보고, 뺨까지 때리잖아! 인정하기 부끄럽지만, 우리 속은 그런 걸 견딜 만큼 강하지 않아.</w:t>
             </w:r>
           </w:p>
         </w:tc>
@@ -7392,7 +7392,7 @@
               <w:rPr>
                 <w:sz w:val="18"/>
               </w:rPr>
-              <w:t>자, 해버렸네! 이렇게 말하면서 완전히 바보가 됐어. 근데 전부 내 잘못은 아냐. 너희가 날 부추긴 거야. 너희가 나를 위해 이걸 해줬어야 했어. 내가 직접 하지 않게 나를 지켜주고 칭찬해줬어야지. 너희도 직접 경험해서 알잖아. 내가 별 볼 일 없는 아무것도 아닌 사람이라도, 너희가 좋아하는 그 잘난 척하는 사도들보다 뒤지지 않았다는 걸. 진짜 사도를 보여주는 모든 표적이 너희와 함께 있던 동안 좋은 때나 나쁜 때나 다 나타났어. 예언의 표적, 기적의 표적, 능력의 표적 말야. 너희가 다른 교회들보다 나나 하나님을 덜 받은 게 있어? 너희가 덜 받은 건 딱 하나, 나를 부양할 책임을 덜 진 거야. 자, 미안해. 너희를 박탈한 거 용서해줘.</w:t>
+              <w:t>자, 해버렸네! 이렇게 말하면서 완전히 바보가 됐어. 근데 전부 내 잘못은 아냐. 너희가 날 부추긴 거야. 너희가 나를 위해 이걸 해줬어야 했어. 내가 직접 하지 않게 나를 지켜주고 칭찬해줬어야지. 너희도 직접 경험해서 알잖아. 내가 별 볼 일 없는 아무것도 아닌 사람이라도, 너희가 좋아하는 그 잘난 척하는 사도들보다 뒤지지 않았다는 걸. 진짜 사도를 보여주는 모든 표적이 너희와 함께 있던 동안 좋은 때나 나쁜 때나 다 나타났어. 징조의 표적, 기적의 표적, 능력의 표적 말야. 너희가 다른 교회들보다 나나 하나님을 덜 받은 게 있어? 너희가 덜 받은 건 딱 하나, 나를 부양할 책임을 덜 진 거야. 자, 미안해. 너희를 박탈한 거 용서해줘.</w:t>
             </w:r>
           </w:p>
         </w:tc>
@@ -7854,7 +7854,7 @@
               <w:rPr>
                 <w:sz w:val="18"/>
               </w:rPr>
-              <w:t>Hey, this is gonna be my third visit to you guys. Remember what the Scripture says: "A matter becomes clear after two or three witnesses give evidence." I've already warned you twice, and I'm warning you again now. If I come back, I'm not going to go easy on anyone who's still living in sin. You want proof that Christ is speaking through me? You'll get it. He's not weak when he's dealing with you; he's powerful. He was crucified in weakness, but now he's alive by God's power. We're weak like he was, but we'll be alive with him by God's power, and we'll deal with you from a position of strength.</w:t>
+              <w:t>Hey, this is gonna be my third visit to you guys. Remember what the Scripture says: "A matter becomes clear after two or three witnesses give evidence." On my second visit I already warned the bunch who keep sinning over and over in the same old ways, and now, still from a distance, I'm warning you again. If you haven't changed your ways by the time I get there, look out — I'm not going to go easy on anyone who's still living in sin. You want proof that Christ is speaking through me? You'll get more than you bargained for — the full force of Christ, don't think you won't. He's not weak when he's dealing with you; he's powerful. He was crucified in sheer weakness and humiliation, but oh, he's alive now — in the mighty power of God! We're weak like he was, but we'll be alive with him by God's power, and we'll deal with you from a position of strength.</w:t>
             </w:r>
           </w:p>
         </w:tc>
@@ -7877,7 +7877,7 @@
               <w:rPr>
                 <w:sz w:val="18"/>
               </w:rPr>
-              <w:t>자, 이번이 너희에게 세 번째 방문이 될 거야. 성경 말씀 기억하지? '두세 명의 증인이 증거하면 일이 분명해진다고.' 이미 두 번 경고했고, 지금 다시 경고하는 거야. 내가 돌아가면 죄 가운데 사는 사람에게 쉽게 넘어가지 않을 거야. 그리스도가 나를 통해 말씀하신다는 증거를 원해? 보여줄게. 그분은 너희를 다루실 때 약하지 않으셔. 강하셔. 그분은 약함 가운데 십자가에 못 박히셨지만, 이제 하나님의 능력으로 살아계셔. 우리도 그분처럼 약하지만, 하나님의 능력으로 그분과 함께 살게 될 거야. 그리고 강자의 자리에서 너희를 대할 거야.</w:t>
+              <w:t>자, 이번이 너희에게 세 번째 방문이 될 거야. 성경 말씀 기억하지? '두세 명의 증인이 증거하면 일이 분명해진다고.' 지난번에 방문했을 때 이미 경고했어. 같은 옛 방식으로 계속 죄짓는 그 무리한테 말야. 그리고 지금, 여전히 멀리서 다시 경고하는 거야. 내가 갔을 때 너희가 바뀌지 않았다면 조심해. 죄 가운데 사는 사람에게는 쉽게 넘어가지 않을 거야. 그리스도가 나를 통해 말씀하신다는 증거를 원해? 기대 이상으로 받게 될 거야 — 그리스도의 온전한 힘을, 절대 아니라고 생각하지 마. 그분은 약함과 치욕 가운데 십자가에 못 박히셨지만, 오, 지금은 살아계셔 — 하나님의 강력한 능력으로! 우리도 그분처럼 약하지만, 하나님의 능력으로 그분과 함께 살게 될 거야. 그리고 강자의 자리에서 너희를 대할 거야.</w:t>
             </w:r>
           </w:p>
         </w:tc>
@@ -8004,7 +8004,7 @@
               <w:rPr>
                 <w:sz w:val="18"/>
               </w:rPr>
-              <w:t>I'm writing this while I'm away so that when I come, I won't have to be harsh. The Lord gave me authority to build you up, not to tear you down.</w:t>
+              <w:t>I'm writing this while I'm away so that when I come, I won't have to be harsh. I want to get on with building you up, not spend my visit on reprimands. The Lord gave me authority to build you up, not to tear you down.</w:t>
             </w:r>
           </w:p>
         </w:tc>
@@ -8027,7 +8027,7 @@
               <w:rPr>
                 <w:sz w:val="18"/>
               </w:rPr>
-              <w:t>내가 없는 동안 이걸 쓰는 건, 내가 갔을 때 엄하게 대하지 않으려는 거야. 주님이 나에게 주신 권위는 너희를 세우라고 주신 거지, 무너뜨리라고 주신 게 아냐.</w:t>
+              <w:t>내가 없는 동안 이걸 쓰는 건, 내가 갔을 때 엄하게 대하지 않으려는 거야. 방문 때는 훈계가 아니라 너희를 세우는 일로 나아가고 싶어. 주님이 나에게 주신 권위는 너희를 세우라고 주신 거지, 무너뜨리라고 주신 게 아냐.</w:t>
             </w:r>
           </w:p>
         </w:tc>

</xml_diff>

<commit_message>
2Corinthians 2nd review: restore 5 (EN 5, KO 3), fix 7:8-9 garble, docs rebuilt+reuploaded
</commit_message>
<xml_diff>
--- a/gdocs_build/2Corinthians.docx
+++ b/gdocs_build/2Corinthians.docx
@@ -666,7 +666,7 @@
               <w:rPr>
                 <w:sz w:val="18"/>
               </w:rPr>
-              <w:t>Everything God has ever promised is a 'yes' in Jesus. That's what we preach, and that's what we pray—the great Amen, God's 'yes' and our 'yes' all together. God makes us strong in Christ and puts his 'yes' inside of us. He's put his Spirit in us as a down payment on everything he's promised to do.</w:t>
+              <w:t>Everything God has ever promised is a 'yes' in Jesus. That's what we preach, and that's what we pray—the great Amen, God's 'yes' and our 'yes' all together, gloriously evident. God makes us strong in Christ and puts his 'yes' inside of us. He's put his Spirit in us as a down payment on everything he's promised to do.</w:t>
             </w:r>
           </w:p>
         </w:tc>
@@ -1275,7 +1275,7 @@
               <w:rPr>
                 <w:sz w:val="18"/>
               </w:rPr>
-              <w:t>When I got to Troas to spread the Message of the Messiah, it was wide open. God had opened the door for me. But when I didn't see my boy Titus there with an update on you guys, I couldn't chill. I was worried about you, so I bounced and went to Macedonia to find him and get some good news. And I did, thank God!</w:t>
+              <w:t>When I got to Troas to spread the Message of the Messiah, it was wide open. God had opened the door for me—all I had to do was walk through it. But when I didn't see my boy Titus there with an update on you guys, I couldn't chill. I was worried about you, so I bounced and went to Macedonia to find him and get some good news. And I did, thank God!</w:t>
             </w:r>
           </w:p>
         </w:tc>
@@ -3989,7 +3989,7 @@
               <w:rPr>
                 <w:sz w:val="18"/>
               </w:rPr>
-              <w:t>Look, I know my last letter was harsh and probably made you feel terrible. I felt bad about it for a minute, but now I see it was for the best. It was a wake-up call. I'm not glad you were upset — but only for a while. I'm stoked that it made you turn toward God instead of away from him — all gain, no loss. It was a total win.</w:t>
+              <w:t>Look, I know my last letter was harsh and probably made you feel terrible. I felt bad about it for a minute, but now I see it was for the best. The letter upset you, but only for a while—it was a wake-up call. Now I'm glad—not that you were upset, but that it made you turn toward God instead of away from him—all gain, no loss. It was a total win.</w:t>
             </w:r>
           </w:p>
         </w:tc>
@@ -4012,7 +4012,7 @@
               <w:rPr>
                 <w:sz w:val="18"/>
               </w:rPr>
-              <w:t>봐, 내 지난 편지가 독했고 너희를 힘들게 했을 거라는 거 알아. 잠깐은 미안했지만, 이제 보니 최선이었어. 정신 차리게 하는 일격이었지. 너희가 괴로워서 기쁜 게 아니라 — 잠깐이었지만 — 그걸로 하나님을 향해 돌아서고 멀어지지 않게 돼서 신나. 얻은 건 다 얻고 잃은 건 하나도 없어. 완전 승리였어.</w:t>
+              <w:t>봐, 내 지난 편지가 독했고 너희를 힘들게 했을 거라는 거 알아. 잠깐은 미안했지만, 이제 보니 최선이었어. 편지가 너희를 힘들게 했지만, 잠깐이었지 — 정신 차리게 하는 일격이었어. 너희가 괴로워서 기쁜 게 아니라, 그걸로 하나님을 향해 돌아서고 멀어지지 않게 돼서 신나. 얻은 건 다 얻고 잃은 건 하나도 없어. 완전 승리였어.</w:t>
             </w:r>
           </w:p>
         </w:tc>
@@ -4060,7 +4060,7 @@
               <w:rPr>
                 <w:sz w:val="18"/>
               </w:rPr>
-              <w:t>Feeling bad in a way that pushes you toward God is a good thing. It puts us back on the road to salvation. You never regret that kind of pain. But when you let tough times push you away from God, you just end up with a life full of regrets, which is a dead end.</w:t>
+              <w:t>Feeling bad in a way that pushes you toward God is a good thing. It turns us around. It puts us back on the road to salvation. You never regret that kind of pain. But when you let tough times push you away from God, you just end up with a life full of regrets, which is a dead end.</w:t>
             </w:r>
           </w:p>
         </w:tc>
@@ -4083,7 +4083,7 @@
               <w:rPr>
                 <w:sz w:val="18"/>
               </w:rPr>
-              <w:t>너희를 하나님께로 이끄는 괴로움은 좋은 거야. 구원의 길로 다시 들어서게 해주거든. 그런 아픔은 절대 후회하지 않아. 하지만 힘든 시간이 하나님에게서 멀어지게 두면, 후회로 가득 찬 인생으로 끝나. 그건 막다른 길이야.</w:t>
+              <w:t>너희를 하나님께로 이끄는 괴로움은 좋은 거야. 방향을 돌이키게 해주거든. 구원의 길로 다시 들어서게 해주거든. 그런 아픔은 절대 후회하지 않아. 하지만 힘든 시간이 하나님에게서 멀어지게 두면, 후회로 가득 찬 인생으로 끝나. 그건 막다른 길이야.</w:t>
             </w:r>
           </w:p>
         </w:tc>
@@ -4456,7 +4456,7 @@
               <w:rPr>
                 <w:sz w:val="18"/>
               </w:rPr>
-              <w:t>This wasn't some planned thing; it was all them. They totally caught us off guard. The secret? They gave themselves to God first, and then to us. The rest of the giving just flowed from God's work in their lives. That's why we hit up Titus to get you guys in on it, to finish what you started. You're already killing it in so many ways—you've got major faith, you're great with words, you're smart, you're passionate, and you love us. So, let's see you crush this, too.</w:t>
+              <w:t>This wasn't some planned thing; it was all them. They totally caught us off guard. The secret? They gave themselves to God first—all in—and then to us. The rest of the giving just flowed from God's work in their lives. That's why we hit up Titus to get you guys in on it, to finish what you started. You're already killing it in so many ways—you've got major faith, you're great with words, you're smart, you're passionate, and you love us. So, let's see you crush this, too.</w:t>
             </w:r>
           </w:p>
         </w:tc>
@@ -4479,7 +4479,7 @@
               <w:rPr>
                 <w:sz w:val="18"/>
               </w:rPr>
-              <w:t>이건 누가 시켜서 한 게 아냐. 전부 걔네 생각이었어. 우리는 완전히 기습당했지. 비결은? 걔네가 먼저 자신을 하나님께 드렸고, 그 다음 우리에게 드린 거야. 나머지 나눔은 그냥 하나님께서 걔네 삶에서 일하신 데서 흘러나온 거였어. 그래서 우리는 디도에게 부탁해서 너희도 이 일에 동참하게 한 거야. 시작한 걸 마무리하려고 말야. 너희는 이미 많은 걸 잘하고 있잖아. 믿음도 크고, 말도 잘하고, 똑똑하고, 열정적이고, 우리를 사랑하지. 그러니까 이것도 끝내주게 해봐.</w:t>
+              <w:t>이건 누가 시켜서 한 게 아냐. 전부 걔네 생각이었어. 우리는 완전히 기습당했지. 비결은? 걔네가 먼저 자신을 하나님께 아낌없이 드렸고, 그 다음 우리에게 드린 거야. 나머지 나눔은 그냥 하나님께서 걔네 삶에서 일하신 데서 흘러나온 거였어. 그래서 우리는 디도에게 부탁해서 너희도 이 일에 동참하게 한 거야. 시작한 걸 마무리하려고 말야. 너희는 이미 많은 걸 잘하고 있잖아. 믿음도 크고, 말도 잘하고, 똑똑하고, 열정적이고, 우리를 사랑하지. 그러니까 이것도 끝내주게 해봐.</w:t>
             </w:r>
           </w:p>
         </w:tc>

</xml_diff>

<commit_message>
배지 정밀 전수조사 (Acts/Romans/1Corinthians/2Corinthians): 독스 .docx 재생성 (reupload VERIFIED OK)
</commit_message>
<xml_diff>
--- a/gdocs_build/2Corinthians.docx
+++ b/gdocs_build/2Corinthians.docx
@@ -3254,7 +3254,7 @@
                 <w:b/>
                 <w:sz w:val="16"/>
               </w:rPr>
-              <w:t>1-10</w:t>
+              <w:t>1-2</w:t>
             </w:r>
           </w:p>
           <w:p>
@@ -3293,7 +3293,7 @@
                 <w:b/>
                 <w:sz w:val="16"/>
               </w:rPr>
-              <w:t>1-10</w:t>
+              <w:t>1-2</w:t>
             </w:r>
           </w:p>
           <w:p>
@@ -3316,7 +3316,7 @@
                 <w:b/>
                 <w:sz w:val="16"/>
               </w:rPr>
-              <w:t>1-10</w:t>
+              <w:t>1-2</w:t>
             </w:r>
           </w:p>
           <w:p>
@@ -3341,7 +3341,7 @@
                 <w:b/>
                 <w:sz w:val="16"/>
               </w:rPr>
-              <w:t>1-10</w:t>
+              <w:t>3-10</w:t>
             </w:r>
           </w:p>
           <w:p>
@@ -3364,7 +3364,7 @@
                 <w:b/>
                 <w:sz w:val="16"/>
               </w:rPr>
-              <w:t>1-10</w:t>
+              <w:t>3-10</w:t>
             </w:r>
           </w:p>
           <w:p>
@@ -3387,7 +3387,7 @@
                 <w:b/>
                 <w:sz w:val="16"/>
               </w:rPr>
-              <w:t>1-10</w:t>
+              <w:t>3-10</w:t>
             </w:r>
           </w:p>
           <w:p>
@@ -3483,7 +3483,7 @@
                 <w:b/>
                 <w:sz w:val="16"/>
               </w:rPr>
-              <w:t>14-18</w:t>
+              <w:t>14-16</w:t>
             </w:r>
           </w:p>
           <w:p>
@@ -3514,7 +3514,7 @@
                 <w:b/>
                 <w:sz w:val="16"/>
               </w:rPr>
-              <w:t>14-18</w:t>
+              <w:t>14-16</w:t>
             </w:r>
           </w:p>
           <w:p>
@@ -3537,7 +3537,7 @@
                 <w:b/>
                 <w:sz w:val="16"/>
               </w:rPr>
-              <w:t>14-18</w:t>
+              <w:t>14-16</w:t>
             </w:r>
           </w:p>
           <w:p>
@@ -3562,7 +3562,7 @@
                 <w:b/>
                 <w:sz w:val="16"/>
               </w:rPr>
-              <w:t>14-18</w:t>
+              <w:t>16-18</w:t>
             </w:r>
           </w:p>
           <w:p>
@@ -3585,7 +3585,7 @@
                 <w:b/>
                 <w:sz w:val="16"/>
               </w:rPr>
-              <w:t>14-18</w:t>
+              <w:t>16-18</w:t>
             </w:r>
           </w:p>
           <w:p>
@@ -3608,7 +3608,7 @@
                 <w:b/>
                 <w:sz w:val="16"/>
               </w:rPr>
-              <w:t>14-18</w:t>
+              <w:t>16-18</w:t>
             </w:r>
           </w:p>
           <w:p>
@@ -4567,7 +4567,7 @@
                 <w:b/>
                 <w:sz w:val="16"/>
               </w:rPr>
-              <w:t>10-20</w:t>
+              <w:t>10-15</w:t>
             </w:r>
           </w:p>
           <w:p>
@@ -4606,7 +4606,7 @@
                 <w:b/>
                 <w:sz w:val="16"/>
               </w:rPr>
-              <w:t>10-20</w:t>
+              <w:t>10-15</w:t>
             </w:r>
           </w:p>
           <w:p>
@@ -4629,7 +4629,7 @@
                 <w:b/>
                 <w:sz w:val="16"/>
               </w:rPr>
-              <w:t>10-20</w:t>
+              <w:t>10-15</w:t>
             </w:r>
           </w:p>
           <w:p>
@@ -4654,7 +4654,7 @@
                 <w:b/>
                 <w:sz w:val="16"/>
               </w:rPr>
-              <w:t>10-20</w:t>
+              <w:t>16-20</w:t>
             </w:r>
           </w:p>
           <w:p>
@@ -4677,7 +4677,7 @@
                 <w:b/>
                 <w:sz w:val="16"/>
               </w:rPr>
-              <w:t>10-20</w:t>
+              <w:t>16-20</w:t>
             </w:r>
           </w:p>
           <w:p>
@@ -4700,7 +4700,7 @@
                 <w:b/>
                 <w:sz w:val="16"/>
               </w:rPr>
-              <w:t>10-20</w:t>
+              <w:t>16-20</w:t>
             </w:r>
           </w:p>
           <w:p>
@@ -5005,7 +5005,7 @@
                 <w:b/>
                 <w:sz w:val="16"/>
               </w:rPr>
-              <w:t>3-5</w:t>
+              <w:t>3-4</w:t>
             </w:r>
           </w:p>
           <w:p>
@@ -5028,7 +5028,7 @@
                 <w:b/>
                 <w:sz w:val="16"/>
               </w:rPr>
-              <w:t>3-5</w:t>
+              <w:t>3-4</w:t>
             </w:r>
           </w:p>
           <w:p>
@@ -5051,7 +5051,7 @@
                 <w:b/>
                 <w:sz w:val="16"/>
               </w:rPr>
-              <w:t>3-5</w:t>
+              <w:t>3-4</w:t>
             </w:r>
           </w:p>
           <w:p>
@@ -5076,7 +5076,7 @@
                 <w:b/>
                 <w:sz w:val="16"/>
               </w:rPr>
-              <w:t>3-5</w:t>
+              <w:t>5</w:t>
             </w:r>
           </w:p>
           <w:p>
@@ -5099,7 +5099,7 @@
                 <w:b/>
                 <w:sz w:val="16"/>
               </w:rPr>
-              <w:t>3-5</w:t>
+              <w:t>5</w:t>
             </w:r>
           </w:p>
           <w:p>
@@ -5122,7 +5122,7 @@
                 <w:b/>
                 <w:sz w:val="16"/>
               </w:rPr>
-              <w:t>3-5</w:t>
+              <w:t>5</w:t>
             </w:r>
           </w:p>
           <w:p>

</xml_diff>